<commit_message>
Translate Jobs screens and landing Jobs/Delivery sections into all languages
</commit_message>
<xml_diff>
--- a/O.A.M DELIVERY SYSTEM.docx
+++ b/O.A.M DELIVERY SYSTEM.docx
@@ -415,7 +415,24 @@
           <w:sz w:val="24"/>
           <w:szCs w:val="24"/>
         </w:rPr>
-        <w:t>This proposal covers the development and integration of a Delivery &amp; Dispatch System within the existing O.A.M platform. The system will enable customers to request deliveries, dispatch riders to manage delivery jobs, and administrators to monitor and manage the complete delivery process.</w:t>
+        <w:t xml:space="preserve">This proposal covers the development and integration of a </w:t>
+      </w:r>
+      <w:r>
+        <w:rPr>
+          <w:rFonts w:ascii="Arial" w:hAnsi="Arial" w:cs="Arial"/>
+          <w:sz w:val="24"/>
+          <w:szCs w:val="24"/>
+          <w:lang w:val="en-US"/>
+        </w:rPr>
+        <w:t xml:space="preserve">fully automated </w:t>
+      </w:r>
+      <w:r>
+        <w:rPr>
+          <w:rFonts w:ascii="Arial" w:hAnsi="Arial" w:cs="Arial"/>
+          <w:sz w:val="24"/>
+          <w:szCs w:val="24"/>
+        </w:rPr>
+        <w:t>Delivery &amp; Dispatch System within the existing O.A.M platform. The system will enable customers to request deliveries, dispatch riders to manage delivery jobs, and administrators to monitor and manage the complete delivery process.</w:t>
       </w:r>
     </w:p>
     <w:p>
@@ -674,6 +691,89 @@
     </w:p>
     <w:p>
       <w:pPr>
+        <w:pStyle w:val="a0"/>
+        <w:numPr>
+          <w:ilvl w:val="0"/>
+          <w:numId w:val="1"/>
+        </w:numPr>
+        <w:rPr>
+          <w:rFonts w:ascii="Arial" w:hAnsi="Arial" w:cs="Arial"/>
+          <w:sz w:val="24"/>
+          <w:szCs w:val="24"/>
+        </w:rPr>
+      </w:pPr>
+      <w:r>
+        <w:rPr>
+          <w:rFonts w:ascii="Arial" w:hAnsi="Arial" w:cs="Arial"/>
+          <w:sz w:val="24"/>
+          <w:szCs w:val="24"/>
+        </w:rPr>
+        <w:t>automatic rider-to-order matching</w:t>
+      </w:r>
+    </w:p>
+    <w:p>
+      <w:pPr>
+        <w:pStyle w:val="a0"/>
+        <w:numPr>
+          <w:ilvl w:val="0"/>
+          <w:numId w:val="1"/>
+        </w:numPr>
+        <w:rPr>
+          <w:rFonts w:ascii="Arial" w:hAnsi="Arial" w:cs="Arial"/>
+          <w:sz w:val="24"/>
+          <w:szCs w:val="24"/>
+        </w:rPr>
+      </w:pPr>
+      <w:r>
+        <w:rPr>
+          <w:rFonts w:ascii="Arial" w:hAnsi="Arial" w:cs="Arial"/>
+          <w:sz w:val="24"/>
+          <w:szCs w:val="24"/>
+        </w:rPr>
+        <w:t xml:space="preserve">route optimization </w:t>
+      </w:r>
+    </w:p>
+    <w:p>
+      <w:pPr>
+        <w:pStyle w:val="a0"/>
+        <w:numPr>
+          <w:ilvl w:val="0"/>
+          <w:numId w:val="1"/>
+        </w:numPr>
+        <w:rPr>
+          <w:rFonts w:ascii="Arial" w:hAnsi="Arial" w:cs="Arial"/>
+          <w:sz w:val="24"/>
+          <w:szCs w:val="24"/>
+        </w:rPr>
+      </w:pPr>
+      <w:r>
+        <w:rPr>
+          <w:rFonts w:ascii="Arial" w:hAnsi="Arial" w:cs="Arial"/>
+          <w:sz w:val="24"/>
+          <w:szCs w:val="24"/>
+        </w:rPr>
+        <w:t>surge pricing</w:t>
+      </w:r>
+      <w:r>
+        <w:rPr>
+          <w:rFonts w:ascii="Arial" w:hAnsi="Arial" w:cs="Arial"/>
+          <w:sz w:val="24"/>
+          <w:szCs w:val="24"/>
+          <w:lang w:val="en-US"/>
+        </w:rPr>
+        <w:t xml:space="preserve"> and </w:t>
+      </w:r>
+      <w:r>
+        <w:rPr>
+          <w:rFonts w:ascii="Arial" w:hAnsi="Arial" w:cs="Arial"/>
+          <w:sz w:val="24"/>
+          <w:szCs w:val="24"/>
+        </w:rPr>
+        <w:t>multiple delivery zones</w:t>
+      </w:r>
+    </w:p>
+    <w:p>
+      <w:pPr>
         <w:pStyle w:val="2"/>
         <w:rPr>
           <w:rFonts w:ascii="Arial" w:hAnsi="Arial" w:cs="Arial"/>
@@ -819,6 +919,7 @@
           <w:sz w:val="24"/>
           <w:szCs w:val="24"/>
         </w:rPr>
+        <w:lastRenderedPageBreak/>
         <w:t>Customer/recipient contact details.</w:t>
       </w:r>
     </w:p>
@@ -885,7 +986,6 @@
           <w:sz w:val="24"/>
           <w:szCs w:val="24"/>
         </w:rPr>
-        <w:lastRenderedPageBreak/>
         <w:t>Availability status: Online/Offline.</w:t>
       </w:r>
     </w:p>
@@ -1484,6 +1584,7 @@
           <w:sz w:val="24"/>
           <w:szCs w:val="24"/>
         </w:rPr>
+        <w:lastRenderedPageBreak/>
         <w:t>O.A.M can generate revenue by taking a commission from completed deliveries and/or applying a service or platform fee.</w:t>
       </w:r>
     </w:p>
@@ -1501,7 +1602,6 @@
           <w:rFonts w:ascii="Arial" w:hAnsi="Arial" w:cs="Arial"/>
           <w:kern w:val="36"/>
         </w:rPr>
-        <w:lastRenderedPageBreak/>
         <w:t>4. Development &amp; Implementation Cost</w:t>
       </w:r>
       <w:r>
@@ -2273,6 +2373,7 @@
           <w:sz w:val="24"/>
           <w:szCs w:val="24"/>
         </w:rPr>
+        <w:lastRenderedPageBreak/>
         <w:t>Other third-party API or service charges.</w:t>
       </w:r>
     </w:p>
@@ -2293,7 +2394,6 @@
           <w:sz w:val="24"/>
           <w:szCs w:val="24"/>
         </w:rPr>
-        <w:lastRenderedPageBreak/>
         <w:t>6. Scope Note</w:t>
       </w:r>
     </w:p>
@@ -3211,7 +3311,7 @@
       <w:pStyle w:val="Header"/>
     </w:pPr>
     <w:r>
-      <w:pict w14:anchorId="54E1C40B">
+      <w:pict w14:anchorId="75DFAFD7">
         <v:shapetype id="_x0000_t75" coordsize="21600,21600" o:spt="75" o:preferrelative="t" path="m@4@5l@4@11@9@11@9@5xe" filled="f" stroked="f">
           <v:stroke joinstyle="miter"/>
           <v:formulas>
@@ -3248,7 +3348,7 @@
       <w:pStyle w:val="Header"/>
     </w:pPr>
     <w:r>
-      <w:pict w14:anchorId="21F40A32">
+      <w:pict w14:anchorId="438F6C7F">
         <v:shapetype id="_x0000_t75" coordsize="21600,21600" o:spt="75" o:preferrelative="t" path="m@4@5l@4@11@9@11@9@5xe" filled="f" stroked="f">
           <v:stroke joinstyle="miter"/>
           <v:formulas>
@@ -3285,7 +3385,7 @@
       <w:pStyle w:val="Header"/>
     </w:pPr>
     <w:r>
-      <w:pict w14:anchorId="15B95154">
+      <w:pict w14:anchorId="5716E616">
         <v:shapetype id="_x0000_t75" coordsize="21600,21600" o:spt="75" o:preferrelative="t" path="m@4@5l@4@11@9@11@9@5xe" filled="f" stroked="f">
           <v:stroke joinstyle="miter"/>
           <v:formulas>

</xml_diff>